<commit_message>
Sync proposal and speaker script with revised plan; add slide outline
</commit_message>
<xml_diff>
--- a/docs/presentation/speaker-script.docx
+++ b/docs/presentation/speaker-script.docx
@@ -64,7 +64,7 @@
     </w:p>
     <w:p>
       <w:r>
-        <w:t>Multimodal reasoning models often explain every intermediate step in full sentences. That creates a practical bottleneck: generating more reasoning tokens increases decoding work and response time for a single answer. The authors' starting point is that detailed explanation contains redundancy. Their bet is that a compact sketch can retain the key logical flow while removing repeated descriptions and commentary. Here, sketch means concise textual reasoning, organized into short numbered steps. It does not mean drawing a new image. The example from the paper connects visual relationships to a short mathematical derivation. The challenge is to learn which information deserves space, because simply asking for fewer words also removes useful reasoning.</w:t>
+        <w:t>Multimodal reasoning models often explain every intermediate step in full sentences. That creates a practical bottleneck: generating more reasoning tokens increases decoding work and response time. The authors start from a simple observation: detailed explanations contain repetition. Their goal is to retain the key logical flow in a compact sketch. Here, sketch means concise textual reasoning, usually organized into numbered steps. It does not mean drawing another image. In this example, visual relationships lead to distances, then a triangle, and finally an area calculation. The challenge is deciding what deserves space. Shortening an explanation helps only if the remaining steps still carry the information needed to solve the problem correctly.</w:t>
       </w:r>
     </w:p>
     <w:p>
@@ -95,7 +95,7 @@
     </w:p>
     <w:p>
       <w:r>
-        <w:t>The framework has three stages with different jobs. First, Sketch-Mode Cold Start teaches the answering model to imitate compressed reasoning traces. Second, a separate SketchJudge Reward Model learns to distinguish sketch-style thinking from normal detailed thinking. Third, Sketch-Thinking Reinforcement Learning uses that judge alongside correctness and format rewards. This division matters. Cold start supplies examples of the target behavior, the judge makes that behavior scoreable, and reinforcement learning trains the model to apply it on another collection of questions across visual domains. The answering model receives images and questions throughout. The judge receives the thinking text. The original pipeline appears below our simplified redraw so the relationship between the presentation and the source stays visible.</w:t>
+        <w:t>The framework has three stages, each with a different job. Cold start teaches the answering model to imitate compressed reasoning traces. A separate SketchJudge then learns to distinguish sketch-style thinking from detailed thinking. Finally, reinforcement learning uses that judge alongside accuracy and format rewards. Cold start supplies examples, the judge supplies a score, and reinforcement learning applies the behavior to new visual questions across visual domains. The answering model receives the image and question. The judge receives only the thinking text. That difference becomes central to our analysis later. The original pipeline appears below the simplified redraw. Together, they show how data preparation, reward modeling, and policy training connect to produce the final sketch-generating model.</w:t>
       </w:r>
     </w:p>
     <w:p>
@@ -126,7 +126,7 @@
     </w:p>
     <w:p>
       <w:r>
-        <w:t>For cold start, the authors construct SketchColdStart-20K. They sample ten thousand questions from LLaVA-CoT-100K and ten thousand from Vision-R1-cold. GPT-5 rewrites the existing long reasoning into short numbered steps. The conversion instructions preserve the order and key logic while removing extra details and examples. The resulting image, question, sketch, and answer examples supervise the multimodal backbone through ordinary next-token training. The default answering backbone is Qwen2.5-VL-7B-Instruct, with a separate three billion parameter version also evaluated. This stage changes both the amount of text and its wording. Therefore, its benefits combine compression with teacher rewriting. The converter ablation tests different teachers, but does not isolate shortening from all other changes to the reasoning content. That distinction matters when we design the later controlled comparison experiments.</w:t>
+        <w:t>For cold start, the authors build SketchColdStart-20K from two existing datasets. They sample ten thousand questions from LLaVA-CoT-100K and ten thousand from Vision-R1-cold. GPT-5 rewrites the long traces into short numbered steps. The conversion prompt receives the reasoning alone and asks it to preserve key facts, logic, and order while removing extra detail. These rewritten examples then supervise the multimodal policy through supervised next-token training. The default backbone is Qwen2.5-VL-7B-Instruct, with a smaller three billion parameter version also evaluated. Rewriting changes both length and content. The converter ablation shows that the teacher matters, but it does not separate shortening from corrections, omissions, or phrasing changes. Our later reward comparison therefore holds the rewritten data and cold-start weights fixed across all four principal experimental arms.</w:t>
       </w:r>
     </w:p>
     <w:p>
@@ -157,7 +157,7 @@
     </w:p>
     <w:p>
       <w:r>
-        <w:t>SketchJudge is a language model rather than the multimodal answering model. The default judge uses Qwen2.5-7B-Instruct. Training pairs each original long trace with label zero and its rewritten sketch with label one, producing forty thousand labeled traces. At reinforcement learning time, the same judge classifies the generated thinking text. Its prompt asks whether the reasoning contains only the key logical flow or detailed analysis. It receives neither the image nor the question. This directly supervises style, while answer accuracy is checked separately. The design also avoids a fixed target length, allowing longer sketches for demanding questions. Its central boundary is equally clear: a positive style label does not verify that a visual premise is correct or explicitly retained under the tested language-only scoring prompt.</w:t>
+        <w:t>SketchJudge uses Qwen2.5-7B-Instruct, a language model. Each original long trace receives label zero, and its rewritten sketch receives label one. That produces forty thousand labeled traces. During reinforcement learning, the judge applies the same style prompt to generated thinking text. It sees neither the image nor the question. Answer accuracy is scored separately. This makes the supervision target clear: learn the style of concise reasoning without imposing one fixed length. A demanding question can still receive a longer sketch. The open issue is whether the score recognizes missing support. A trace can state correct calculations and look concise while leaving an essential visual premise unstated. We will use that distinction between style and explicit support to frame the first limitation and our proposed experiment.</w:t>
       </w:r>
     </w:p>
     <w:p>
@@ -188,7 +188,7 @@
     </w:p>
     <w:p>
       <w:r>
-        <w:t>The reinforcement learning stage uses GRPO, which compares sampled responses to the same question. The paper samples five rollouts per group. Each response receives a weighted reward: zero point five for accuracy, zero point four for format, and zero point one for thinking style. The style component is binary. For a worked example, a correct answer with valid format and sketch style receives one point. If the answer is wrong but format and style pass, it receives zero point five. These are arithmetic examples of the stated reward, not experimental observations. Group rewards are centered and scaled to obtain relative advantages. A clipped policy update favors higher advantage responses, while a KL penalty limits departure from the reference policy. There is no explicit token penalty in this default objective; shorter traces emerge from style supervision during each sampled training group.</w:t>
+        <w:t>The reinforcement learning stage uses GRPO to compare responses sampled for the same question. The paper uses five rollouts per group. Each response receives zero point five for accuracy, zero point four for format, and zero point one for thinking style. The style score is binary. A correct answer that passes format and style receives a total reward of one. A wrong answer that passes those two checks receives zero point five. These examples apply the reward equation. GRPO centers and scales the group rewards to obtain relative advantages, then uses a clipped policy update to favor stronger responses. A KL penalty anchors the policy to its reference. The default objective has no explicit token penalty. Compression comes through the examples and style signal, so the reward does not directly test whether every necessary visual premise remains in the trace.</w:t>
       </w:r>
     </w:p>
     <w:p>
@@ -219,7 +219,7 @@
     </w:p>
     <w:p>
       <w:r>
-        <w:t>The main evaluation spans four benchmarks: MMMU for broad multimodal reasoning, MATH-Vision for visual mathematics, VisuLogic for visual logic, and PhyX for physics. The paper labels MATH-Vision as MathVision in its tables. Training for reinforcement learning uses SketchRL-1K, with two hundred fifty questions from each of MMStar, MathVista, LogicVista, and SeePhys. Baselines cover direct R1-style training, prompting, supervised fine tuning, and length-oriented reinforcement learning. The reported metrics are final answer accuracy and average reasoning tokens. Efficiency of Thinking divides accuracy, expressed in percentage points, by reasoning tokens. I will keep accuracy and cost visible separately, because an efficiency ratio alone hides whether a shorter model also loses correct answers rather than a single combined score.</w:t>
+        <w:t>Evaluation covers MMMU, MathVision, VisuLogic, and PhyX: broad reasoning, visual mathematics, visual logic, and physics. MathVision is the paper's name for MATH-Vision. The reinforcement learning set contains two hundred fifty questions from each of MMStar, MathVista, LogicVista, and SeePhys, giving one thousand examples. The trainable baselines share source questions, with different trace-construction methods. Comparisons include prompting, supervised training, and length-oriented reinforcement learning. The main evaluation measurements are answer accuracy and average reasoning tokens. Efficiency of Thinking divides accuracy by token count. That ratio rewards brevity, but it can rise when accuracy falls. I will therefore keep the two measurements separate and read each efficiency claim alongside its corresponding accuracy comparison throughout the results that follow.</w:t>
       </w:r>
     </w:p>
     <w:p>
@@ -250,7 +250,7 @@
     </w:p>
     <w:p>
       <w:r>
-        <w:t>Table one provides the strongest evidence for the headline. At seven billion parameters, MMMU accuracy rises from sixty one to sixty two point eight percent, while average reasoning tokens fall from one hundred eighty two point two to sixty four point three. Across the four benchmarks, token reductions range from sixty four point seven to seventy six point five percent, calculated directly from the reported means. Accuracy also increases in every benchmark, although the margins differ. VisuLogic gains only zero point two percentage points, whereas PhyX gains one point nine. The chart shows token savings, and the adjacent table preserves the accuracy comparison. These are reported point estimates. The paper does not provide confidence intervals for these main results, so the smallest gains do not establish a reliable advantage across multiple independent repeated training runs.</w:t>
+        <w:t>Table one gives the strongest evidence for the headline. At seven billion parameters, MMMU accuracy rises from sixty one to sixty two point eight percent. Average reasoning tokens fall from one hundred eighty two point two to sixty four point three. Across all four benchmarks, the recomputed token reductions range from sixty four point seven to seventy six point five percent. Accuracy increases in each comparison, with gains ranging from zero point two points on VisuLogic to one point nine on PhyX. The plot shows reasoning token counts, and the table preserves accuracy beside them. One useful boundary is that Constrained CoT uses fewer tokens on PhyX: seventy three point four versus seventy five point three. The sketch method combines strong compression with better accuracy, rather than attaining the shortest output in every listed comparison.</w:t>
       </w:r>
     </w:p>
     <w:p>
@@ -281,7 +281,7 @@
     </w:p>
     <w:p>
       <w:r>
-        <w:t>This plot places every method from the MMMU section of Table one on the same axes. Moving left reduces reasoning tokens; moving up improves accuracy. SketchThinker-R1 occupies the upper left relative to all listed baselines. Prompting methods shorten the output, but their accuracy falls below Vanilla-R1. The supervised and length-oriented reinforcement learning baselines lie between those extremes. For this dataset and backbone, the complete sketch pipeline improves both measured objectives. This is a comparison among the reported operating points, not a complete frontier over all possible budgets. The table does not establish the best achievable accuracy for every baseline after an identical sweep of decoding settings, reward weights, and training compute and other relevant choices.</w:t>
+        <w:t>This plot puts the MMMU operating points on common axes. Left means fewer reasoning tokens; up means higher accuracy. SketchThinker-R1 sits above and to the left of the listed baselines. Prompting shortens responses but loses accuracy relative to Vanilla-R1. Supervised methods and length-oriented reinforcement learning occupy intermediate positions. The full pipeline therefore improves both reported measurements here. To compare accuracy and cost frontiers, we would also need matched budget sweeps, tuning effort, and measured training compute. The paper reports operating points without repeated-training intervals. That matters especially for small accuracy differences. Our own experiment will compare achieved lengths and show seed variation separately from uncertainty caused by sampling different problem families from the evaluation population.</w:t>
       </w:r>
     </w:p>
     <w:p>
@@ -299,7 +299,7 @@
         <w:pStyle w:val="Heading1"/>
       </w:pPr>
       <w:r>
-        <w:t>Slide 10 — Cold start and RL contribute together</w:t>
+        <w:t>Slide 10 — Stage ablations leave the reward effect unresolved</w:t>
       </w:r>
     </w:p>
     <w:p>
@@ -312,12 +312,12 @@
     </w:p>
     <w:p>
       <w:r>
-        <w:t>The stage ablation explains why the authors combine imitation and reinforcement learning. On MMMU, cold start alone reaches sixty one point four percent accuracy with one hundred fourteen point five reasoning tokens. Reinforcement learning alone reaches sixty two point one percent with one hundred fifty two point two tokens. Combining both reaches sixty two point eight percent with sixty four point three tokens. That supports complementary contributions from the two stages under the tested setup. The judge ablation also favors a fine tuned seven billion parameter judge over the corresponding model used without fine tuning. However, these experiments do not isolate a unique causal mechanism inside the traces. Different converters also change final accuracy, so teacher quality and rewritten content remain part of the explanation.</w:t>
+        <w:t>The ablations support combining cold start with reinforcement learning. On MMMU, cold start alone reaches sixty one point four percent with one hundred fourteen point five tokens. Reinforcement learning alone reaches sixty two point one percent with one hundred fifty two point two tokens. Together they reach sixty two point eight percent with sixty four point three tokens. Judge fine-tuning also helps. The appendix tests reward schedules, scaling, and a tuned long-trace cold-start baseline. These are meaningful experimental controls. The remaining attribution test removes style reward while keeping the compressed cold-start weights and other RL conditions fixed. Likewise, the cold-start quality audit checks preserved key steps, but learned-policy sufficiency needs its own independent evaluation. That leads to five specific limitations and the experiments they motivate.</w:t>
       </w:r>
     </w:p>
     <w:p>
       <w:r>
-        <w:t>Source cue (not spoken): PDF p.7, Tables3a,3b,3d</w:t>
+        <w:t>Source cue (not spoken): PDF p.7, Tables3a/3b/3d; pp.16–17, Tables5–8; p.19, Table14</w:t>
       </w:r>
     </w:p>
     <w:p>
@@ -330,7 +330,7 @@
         <w:pStyle w:val="Heading1"/>
       </w:pPr>
       <w:r>
-        <w:t>Slide 11 — The 3B result exposes an accuracy boundary</w:t>
+        <w:t>Slide 11 — Five limitations define the next tests</w:t>
       </w:r>
     </w:p>
     <w:p>
@@ -338,17 +338,17 @@
         <w:pStyle w:val="Subtitle"/>
       </w:pPr>
       <w:r>
-        <w:t>Part I · 09:07–10:05 · 125 words · 57.7 seconds</w:t>
+        <w:t>Part I · 09:07–10:18 · 155 words · 71.5 seconds</w:t>
       </w:r>
     </w:p>
     <w:p>
       <w:r>
-        <w:t>The smaller model prevents us from turning the headline into a universal claim. Table two reports strong token savings at three billion parameters, but MATH-Vision accuracy falls from twenty six point nine percent for Vanilla-R1 to twenty five point three for SketchThinker-R1. That is a loss of one point six percentage points. MMMU, VisuLogic, and PhyX show positive accuracy differences. The correct reading is that compression and answer quality trade differently across tasks and model sizes. This single comparison does not identify deleted visual evidence as the cause. It motivates checking what information survives compression and evaluating harder problems separately. For our own study, accuracy and explicit explanation sufficiency will remain distinct measurements, across the full range of token budgets, even when both improve together.</w:t>
+        <w:t>The first limitation is reward validity. SketchJudge scores text style, while Appendix H checks cold-start preservation. Neither directly measures missing visual support in the learned policy's outputs. Second is attribution: we still need the incremental effect of style reward under shared cold-start weights and RL conditions. Third is the accuracy tradeoff. At three billion parameters, MathVision accuracy drops from twenty six point nine to twenty five point three percent. Difficulty groups, repeated training, and a disjoint selection split deserve attention. Fourth is transfer. Results cover one backbone family at two scales; longer deliberation and other families need testing. Fifth is full cost and reproduction. Appendix J reports timing, but a unified ledger must include preparation and judge costs. Batch size is reported as one hundred twenty eight versus five hundred twelve, and hardware as eight H200 versus eight H800. These gaps point to targeted follow-up experiments rather than a rejection of the demonstrated token savings.</w:t>
       </w:r>
     </w:p>
     <w:p>
       <w:r>
-        <w:t>Source cue (not spoken): PDF p.6, Table2</w:t>
+        <w:t>Source cue (not spoken): Revised analysis L1–L5; paper §2.2, Tables1–3/7–15, App.D.3–J</w:t>
       </w:r>
     </w:p>
     <w:p>
@@ -361,7 +361,7 @@
         <w:pStyle w:val="Heading1"/>
       </w:pPr>
       <w:r>
-        <w:t>Slide 12 — Appendix results refine the efficiency claim</w:t>
+        <w:t>Slide 12 — Three directions target different interventions</w:t>
       </w:r>
     </w:p>
     <w:p>
@@ -369,17 +369,17 @@
         <w:pStyle w:val="Subtitle"/>
       </w:pPr>
       <w:r>
-        <w:t>Part I · 10:05–11:07 · 135 words · 62.3 seconds</w:t>
+        <w:t>Part I · 10:18–11:12 · 115 words · 53.1 seconds</w:t>
       </w:r>
     </w:p>
     <w:p>
       <w:r>
-        <w:t>The appendix adds useful qualifications and extensions. On MMMU, dynamic reward weighting improves on the fixed default, reaching sixty three point two percent accuracy with sixty two point five reasoning tokens. Therefore, a fixed style coefficient is a design choice rather than a demonstrated optimum across schedules. Scaling the reinforcement learning set from one thousand to five thousand examples raises the seven billion parameter model's MMMU accuracy from sixty two point eight to sixty six point one percent. The reported training time decreases from two point seven zero hours for Vanilla-R1 to two point two one hours for SketchThinker-R1 on eight H800 GPUs under that configuration. Finally, human interpretability scores improve, but that study uses only twenty jointly correct examples and five evaluators. Readability evidence is valuable; it does not independently verify complete visual support.</w:t>
+        <w:t>Three directions follow from those gaps. Direction one changes what we reward: preserve explicit visual support, including premises a short trace leaves out. Existing multimodal process reward models already check steps; the new comparison asks whether detecting omissions adds value. Direction two changes how we allocate inference compute. An image-conditioned router would choose budgets while constraining accuracy loss in prespecified difficulty and visual-dependency groups. Direction three changes how we attribute training gains and count costs. Cross trace construction with style reward, then calculate when inference savings repay preparation and training. These directions address supervision, allocation, and lifecycle efficiency. We choose the first because omission-sensitive judgment can be tested directly before fully committing to policy training.</w:t>
       </w:r>
     </w:p>
     <w:p>
       <w:r>
-        <w:t>Source cue (not spoken): PDF pp.16–18, Tables7,9,11; p.20, Table15</w:t>
+        <w:t>Source cue (not spoken): Revised analysis Directions 1–3; process supervision and budget-control primary sources linked there</w:t>
       </w:r>
     </w:p>
     <w:p>
@@ -392,7 +392,7 @@
         <w:pStyle w:val="Heading1"/>
       </w:pPr>
       <w:r>
-        <w:t>Slide 13 — Efficient answers leave evidence preservation unresolved</w:t>
+        <w:t>Slide 13 — Probe D1: does omission detection add value?</w:t>
       </w:r>
     </w:p>
     <w:p>
@@ -400,17 +400,17 @@
         <w:pStyle w:val="Subtitle"/>
       </w:pPr>
       <w:r>
-        <w:t>Part I · 11:07–12:00 · 115 words · 53.1 seconds</w:t>
+        <w:t>Part I · 11:12–12:00 · 105 words · 48.5 seconds</w:t>
       </w:r>
     </w:p>
     <w:p>
       <w:r>
-        <w:t>My assessment is that the paper establishes a practical training recipe for shorter multimodal reasoning, with especially strong token savings in its seven billion parameter comparisons. The evidence boundary has three parts. First, style supervision does not directly inspect visual grounding. Second, reported point estimates and limited human studies leave uncertainty about small gains and difficult subgroups. Third, reproduction requires resolving reporting inconsistencies, including different rollout batch sizes in the main text and appendix. The cold-start quality checks assess preservation of key steps, but they do not measure necessary visual premises in generated benchmark traces. That unresolved measurement problem leads to our research plan: evaluate whether compressed explanations explicitly preserve the evidence supporting their answers.</w:t>
+        <w:t>The probing question is whether omission-sensitive supervision improves accuracy and explicit support at matched length and compute. Start with paired judge examples: a complete trace, a correct-answer trace missing a visual premise, and a harmless redundant-step deletion. Keep their length and format comparable. A useful judge must reject the missing support and accept the valid compression. Then compare sufficiency against style, stated-step correctness, and zero auxiliary reward. Independent human evaluation includes wrong answers and alternative proofs. Checked image pairs test both-correct answers and valid support, with nuisance edits checking invariance. That sequence turns the supervision gap into a measurable experiment, which I will now pitch.</w:t>
       </w:r>
     </w:p>
     <w:p>
       <w:r>
-        <w:t>Source cue (not spoken): PDF §2.2, Tables1–3,11–14; §3 versus App.D.3</w:t>
+        <w:t>Source cue (not spoken): Revised analysis §3, Direction 1; HTML plan, Proposed Solution</w:t>
       </w:r>
     </w:p>
     <w:p>
@@ -436,12 +436,12 @@
     </w:p>
     <w:p>
       <w:r>
-        <w:t>Our plan is titled Preserving Visual Evidence in Compressed Multimodal Reasoning. The question is whether image-conditioned sufficiency supervision improves the accuracy and length tradeoff beyond style supervision. We define a sufficient trace as an explicit set of correct visual premises and valid deductions supporting its returned answer. Consider a triangle whose two given angles appear only in the image. A calculation that silently imports those readings leaves its premises unstated. A compact trace that explicitly states the angle readings and then applies the triangle sum supplies independently checkable support. We accept validated alternative derivations and allow redundant statements to disappear. This targets explanation sufficiency, not a claim about the model's hidden causal reasoning. We will test visual omission, reward effectiveness, and whether any advantage survives controls for rewriting and compute.</w:t>
+        <w:t>Our plan is called Preserving Visual Evidence in Compressed Multimodal Reasoning. A sufficient trace must explicitly state correct visual premises and valid deductions supporting its returned answer. Here, the triangle has two angle labels visible only in the image. Reading forty and sixty degrees, then applying the triangle sum, supports eighty degrees. If the trace silently imports those readings, its arithmetic can be correct while its support is incomplete. The image checks stated facts; it does not fill omissions. We accept validated complete alternative proofs and allow redundant steps to disappear. The sufficiency judge learns from supported traces, premise deletions with correct answers, false readings, invalid deductions, and harmless redundant-step deletions. A stated-step correctness judge receives exactly the same inputs, making completeness the key experimental difference between their supervision targets.</w:t>
       </w:r>
     </w:p>
     <w:p>
       <w:r>
-        <w:t>Source cue (not spoken): Research plan; proposal §§1,3; illustrative example</w:t>
+        <w:t>Source cue (not spoken): HTML plan; revised analysis, Direction 1; illustrative geometry example</w:t>
       </w:r>
     </w:p>
     <w:p>
@@ -454,7 +454,7 @@
         <w:pStyle w:val="Heading1"/>
       </w:pPr>
       <w:r>
-        <w:t>Slide 15 — Compare evidence and style under shared data and compute</w:t>
+        <w:t>Slide 15 — Four rewards share data, initialization, and compute</w:t>
       </w:r>
     </w:p>
     <w:p>
@@ -467,12 +467,12 @@
     </w:p>
     <w:p>
       <w:r>
-        <w:t>The planned experiment uses one seven billion parameter answering model and a separate image-conditioned judge. Three reward arms share the same rewritten examples and cold-start weights: evidence reward, style reward, and a zero auxiliary component. Evidence and style are binary and carry the same coefficient. We plan twenty four hundred rendered geometry and bar-chart problems, split by template family, plus checked answer-changing and nuisance-edit image pairs. The judge learns from supported traces, missing-premise negatives, wrong readings, and invalid deductions. We will compare answer accuracy, necessary-premise retention, human sufficiency, and paired-image correctness. Operating points must match achieved average reasoning lengths within five percent. Compute accounting includes rollouts and judge inference. Separate rewriting controls and an image-ablated judge test the contribution of content changes and visual access on the held-out test problems.</w:t>
+        <w:t>We will render three thousand geometry and bar-chart problems, split by template family into sixteen hundred training, four hundred development, and one thousand test problems. Four arms share compressed cold-start data and Qwen2.5-VL-7B weights: sufficiency, style, stated-step correctness, and zero auxiliary reward. Each uses three seeds and one shared budget-conditioned policy targeting sixty four, one hundred twenty eight, and two hundred fifty six tokens. Achieved means must match within five percent, and training compute includes rollouts and judge scoring. Two annotators audit three hundred test problems across every arm and seed, including wrong answers. Two hundred answer-changing pairs and one hundred nuisance pairs test visual robustness. Separate ablations remove judge image access and omission-negative training. Long reasoning and direct answers provide reference points for interpreting both accuracy and compression.</w:t>
       </w:r>
     </w:p>
     <w:p>
       <w:r>
-        <w:t>Source cue (not spoken): Proposal §§3–4; all sample sizes and targets are planned</w:t>
+        <w:t>Source cue (not spoken): Revised analysis, Direction 1: data, setup, controls and ablations</w:t>
       </w:r>
     </w:p>
     <w:p>
@@ -485,7 +485,7 @@
         <w:pStyle w:val="Heading1"/>
       </w:pPr>
       <w:r>
-        <w:t>Slide 16 — A six-month plan with explicit success and null outcomes</w:t>
+        <w:t>Slide 16 — Gate first; test useful gains within the compute cap</w:t>
       </w:r>
     </w:p>
     <w:p>
@@ -498,12 +498,12 @@
     </w:p>
     <w:p>
       <w:r>
-        <w:t>The six-month schedule begins with reproduction and a compute pilot, then diagram annotation, judge calibration, policy training, controlled tests, and a final human audit. Before policy training, the judge must meet development targets of at most ten percent false acceptance and at least seventy percent sufficient-trace recall. We retain three training seeds and reduce the number of budget settings if measured compute exceeds available capacity. Our prediction is improved premise retention and accuracy at matched lengths and compute. The experiment also has clear null outcomes: no accuracy gain, poor judge transfer, or gains that disappear under resource controls weaken that prediction. Retention gains alone support explanation quality. The deliverable is a controlled answer to the evidence-preservation question, with calibrated judgments, reproducible comparisons, and published failure cases alongside any successful results.</w:t>
+        <w:t>We begin with frozen-policy judge diagnostics and a measured throughput pilot. Before policy training, development false acceptance must be at most ten percent, with sufficient-trace recall at least seventy percent. Near one hundred twenty eight achieved tokens, success requires three percentage points more accuracy and five points more human sufficiency than style supervision, with both paired confidence intervals above zero. We report family-clustered uncertainty and each seed's effect. Two eighty-gigabyte accelerators support a four hundred accelerator-hour cap: twelve principal runs at twenty five hours, plus one hundred hours for shared preparation, judges, selection, evaluation, and ablations. If throughput falls short, we reduce data or steps equally while retaining seeds and the primary contrast. The outcome will show when explicit-support supervision improves compressed reasoning and when it offers no useful advantage.</w:t>
       </w:r>
     </w:p>
     <w:p>
       <w:r>
-        <w:t>Source cue (not spoken): Proposal §§3–5; planned milestones, thresholds, and resources</w:t>
+        <w:t>Source cue (not spoken): Revised analysis, Direction 1: judge gate, success criterion and compute</w:t>
       </w:r>
     </w:p>
     <w:p>
@@ -1020,7 +1020,7 @@
           </w:tcPr>
           <w:p>
             <w:r>
-              <w:t>125</w:t>
+              <w:t>155</w:t>
             </w:r>
           </w:p>
         </w:tc>
@@ -1030,7 +1030,7 @@
           </w:tcPr>
           <w:p>
             <w:r>
-              <w:t>09:07–10:05</w:t>
+              <w:t>09:07–10:18</w:t>
             </w:r>
           </w:p>
         </w:tc>
@@ -1062,7 +1062,7 @@
           </w:tcPr>
           <w:p>
             <w:r>
-              <w:t>135</w:t>
+              <w:t>115</w:t>
             </w:r>
           </w:p>
         </w:tc>
@@ -1072,7 +1072,7 @@
           </w:tcPr>
           <w:p>
             <w:r>
-              <w:t>10:05–11:07</w:t>
+              <w:t>10:18–11:12</w:t>
             </w:r>
           </w:p>
         </w:tc>
@@ -1104,7 +1104,7 @@
           </w:tcPr>
           <w:p>
             <w:r>
-              <w:t>115</w:t>
+              <w:t>105</w:t>
             </w:r>
           </w:p>
         </w:tc>
@@ -1114,7 +1114,7 @@
           </w:tcPr>
           <w:p>
             <w:r>
-              <w:t>11:07–12:00</w:t>
+              <w:t>11:12–12:00</w:t>
             </w:r>
           </w:p>
         </w:tc>

</xml_diff>